<commit_message>
Lab8: replace manual TOC with a real Word TOC field (indexation)
</commit_message>
<xml_diff>
--- a/Lab8/Lab8_PlesuDinu_FAF-241.docx
+++ b/Lab8/Lab8_PlesuDinu_FAF-241.docx
@@ -232,102 +232,58 @@
     </w:p>
     <w:p>
       <w:pPr>
-        <w:spacing w:after="50" w:line="270" w:lineRule="auto"/>
-        <w:tabs>
-          <w:tab w:val="right" w:leader="dot" w:pos="9000"/>
-        </w:tabs>
-      </w:pPr>
-      <w:r>
-        <w:rPr>
-          <w:sz w:val="20"/>
-          <w:szCs w:val="20"/>
-        </w:rPr>
-        <w:t xml:space="preserve">1 Purpose of the Work</w:t>
-      </w:r>
-      <w:r>
-        <w:tab/>
-      </w:r>
-      <w:r>
-        <w:rPr>
-          <w:sz w:val="20"/>
-          <w:szCs w:val="20"/>
-        </w:rPr>
-        <w:t xml:space="preserve">3</w:t>
-      </w:r>
-    </w:p>
-    <w:p>
-      <w:pPr>
-        <w:spacing w:after="50" w:line="270" w:lineRule="auto"/>
-        <w:tabs>
-          <w:tab w:val="right" w:leader="dot" w:pos="9000"/>
-        </w:tabs>
-      </w:pPr>
-      <w:r>
-        <w:rPr>
-          <w:sz w:val="20"/>
-          <w:szCs w:val="20"/>
-        </w:rPr>
-        <w:t xml:space="preserve">2 Part 1 – run</w:t>
-      </w:r>
-      <w:r>
-        <w:tab/>
-      </w:r>
-      <w:r>
-        <w:rPr>
-          <w:sz w:val="20"/>
-          <w:szCs w:val="20"/>
-        </w:rPr>
-        <w:t xml:space="preserve">3</w:t>
-      </w:r>
-    </w:p>
-    <w:p>
-      <w:pPr>
-        <w:spacing w:after="50" w:line="270" w:lineRule="auto"/>
-        <w:tabs>
-          <w:tab w:val="right" w:leader="dot" w:pos="9000"/>
-        </w:tabs>
-      </w:pPr>
-      <w:r>
-        <w:rPr>
-          <w:sz w:val="20"/>
-          <w:szCs w:val="20"/>
-        </w:rPr>
-        <w:t xml:space="preserve">3 Part 2 – pingpong</w:t>
-      </w:r>
-      <w:r>
-        <w:tab/>
-      </w:r>
-      <w:r>
-        <w:rPr>
-          <w:sz w:val="20"/>
-          <w:szCs w:val="20"/>
-        </w:rPr>
-        <w:t xml:space="preserve">3</w:t>
-      </w:r>
-    </w:p>
-    <w:p>
-      <w:pPr>
-        <w:spacing w:after="50" w:line="270" w:lineRule="auto"/>
-        <w:tabs>
-          <w:tab w:val="right" w:leader="dot" w:pos="9000"/>
-        </w:tabs>
-      </w:pPr>
-      <w:r>
-        <w:rPr>
-          <w:sz w:val="20"/>
-          <w:szCs w:val="20"/>
-        </w:rPr>
-        <w:t xml:space="preserve">4 Conclusion</w:t>
-      </w:r>
-      <w:r>
-        <w:tab/>
-      </w:r>
-      <w:r>
-        <w:rPr>
-          <w:sz w:val="20"/>
-          <w:szCs w:val="20"/>
-        </w:rPr>
-        <w:t xml:space="preserve">4</w:t>
+        <w:spacing w:after="130"/>
+      </w:pPr>
+      <w:r>
+        <w:fldChar w:fldCharType="begin" w:dirty="true"/>
+      </w:r>
+      <w:r>
+        <w:instrText xml:space="preserve"> TOC \o "1-2" \h \z \u </w:instrText>
+      </w:r>
+      <w:r>
+        <w:fldChar w:fldCharType="separate"/>
+      </w:r>
+      <w:r>
+        <w:rPr>
+          <w:sz w:val="20"/>
+        </w:rPr>
+        <w:t>1.  Purpose of the Work</w:t>
+      </w:r>
+    </w:p>
+    <w:p>
+      <w:pPr>
+        <w:spacing w:after="130"/>
+      </w:pPr>
+      <w:r>
+        <w:rPr>
+          <w:sz w:val="20"/>
+        </w:rPr>
+        <w:t>2.  Part 1 – run</w:t>
+      </w:r>
+    </w:p>
+    <w:p>
+      <w:pPr>
+        <w:spacing w:after="130"/>
+      </w:pPr>
+      <w:r>
+        <w:rPr>
+          <w:sz w:val="20"/>
+        </w:rPr>
+        <w:t>3.  Part 2 – pingpong</w:t>
+      </w:r>
+    </w:p>
+    <w:p>
+      <w:pPr>
+        <w:spacing w:after="130"/>
+      </w:pPr>
+      <w:r>
+        <w:rPr>
+          <w:sz w:val="20"/>
+        </w:rPr>
+        <w:t>4.  Conclusion</w:t>
+      </w:r>
+      <w:r>
+        <w:fldChar w:fldCharType="end"/>
       </w:r>
     </w:p>
     <w:p>
@@ -344,6 +300,7 @@
       </w:r>
     </w:p>
     <w:p>
+      <w:bookmarkStart w:id="1001" w:name="_Toc1001"/>
       <w:pPr>
         <w:pStyle w:val="Heading1"/>
         <w:jc w:val="left"/>
@@ -358,6 +315,7 @@
         <w:t xml:space="preserve">1.  Purpose of the Work</w:t>
       </w:r>
       <w:bookmarkEnd w:id="2"/>
+      <w:bookmarkEnd w:id="1001"/>
     </w:p>
     <w:p>
       <w:pPr>
@@ -369,6 +327,7 @@
       </w:r>
     </w:p>
     <w:p>
+      <w:bookmarkStart w:id="1002" w:name="_Toc1002"/>
       <w:pPr>
         <w:pStyle w:val="Heading1"/>
         <w:jc w:val="left"/>
@@ -383,6 +342,7 @@
         <w:t xml:space="preserve">2.  Part 1 – run</w:t>
       </w:r>
       <w:bookmarkEnd w:id="3"/>
+      <w:bookmarkEnd w:id="1002"/>
     </w:p>
     <w:p>
       <w:pPr>
@@ -628,6 +588,7 @@
       </w:r>
     </w:p>
     <w:p>
+      <w:bookmarkStart w:id="1003" w:name="_Toc1003"/>
       <w:pPr>
         <w:pStyle w:val="Heading1"/>
         <w:jc w:val="left"/>
@@ -642,6 +603,7 @@
         <w:t xml:space="preserve">3.  Part 2 – pingpong</w:t>
       </w:r>
       <w:bookmarkEnd w:id="4"/>
+      <w:bookmarkEnd w:id="1003"/>
     </w:p>
     <w:p>
       <w:pPr>
@@ -979,6 +941,7 @@
       </w:r>
     </w:p>
     <w:p>
+      <w:bookmarkStart w:id="1004" w:name="_Toc1004"/>
       <w:pPr>
         <w:pStyle w:val="Heading1"/>
         <w:jc w:val="left"/>
@@ -993,6 +956,7 @@
         <w:t xml:space="preserve">4.  Conclusion</w:t>
       </w:r>
       <w:bookmarkEnd w:id="5"/>
+      <w:bookmarkEnd w:id="1004"/>
     </w:p>
     <w:p>
       <w:pPr>

</xml_diff>